<commit_message>
Clear all diagnostic URL parameters on reload and link repository in guide
</commit_message>
<xml_diff>
--- a/docs/nms/Netperf_Offline_RHEL_9_Guide.docx
+++ b/docs/nms/Netperf_Offline_RHEL_9_Guide.docx
@@ -638,6 +638,16 @@
         <w:t>Netperf is supplied here by the Fedora EPEL community repository. Do not describe it as a package shipped on the RHEL DVD. Package availability and repository versions may change; the installed version above records the exact build verified for this VM.</w:t>
       </w:r>
     </w:p>
+    <w:p>
+      <w:r>
+        <w:t xml:space="preserve">Plugin source and updates: </w:t>
+      </w:r>
+      <w:hyperlink r:id="rId17">
+        <w:r>
+          <w:t>https://github.com/SKhan009/cacti-nms-plugin</w:t>
+        </w:r>
+      </w:hyperlink>
+    </w:p>
     <w:sectPr>
       <w:footerReference w:type="default" r:id="rId16"/>
       <w:pgSz w:w="12240" w:h="15840"/>

</xml_diff>

<commit_message>
Add node management, offline maps and expanded protocol diagnostics
Improve topology dragging, diagnostic result consistency and shared UI components. Bundle local map assets, document RHEL deployment and include updated installation guides and regression checks.
</commit_message>
<xml_diff>
--- a/docs/nms/Netperf_Offline_RHEL_9_Guide.docx
+++ b/docs/nms/Netperf_Offline_RHEL_9_Guide.docx
@@ -7,12 +7,12 @@
         <w:pStyle w:val="Title"/>
       </w:pPr>
       <w:r>
-        <w:t>Netperf offline installation for RHEL 9</w:t>
+        <w:t>Install and verify Netperf on RHEL 9</w:t>
       </w:r>
     </w:p>
     <w:p>
       <w:r>
-        <w:t>Installation and verification guide for the Cacti NMS collector. Prepared 22 September 2026. All administrative commands below run in a root shell and deliberately omit sudo. Use your approved root login or run su - first.</w:t>
+        <w:t>Offline source installation using the working RHEL 9.4 commands in your log. Run as your normal user; use sudo for system changes. The source folder and RHEL DVD ISO must already be on the machine.</w:t>
       </w:r>
     </w:p>
     <w:p>
@@ -20,17 +20,48 @@
         <w:pStyle w:val="Heading1"/>
       </w:pPr>
       <w:r>
-        <w:t>Verified installation</w:t>
+        <w:t>1 Prepare the build tools</w:t>
       </w:r>
     </w:p>
     <w:p>
       <w:r>
-        <w:t>The VM runs RHEL 9.8 on aarch64. Netperf was absent from the mounted RHEL DVD repositories. The signed Fedora EPEL 9 package was downloaded on the connected Mac, transferred to the VM and installed with every repository disabled. No firewall or SELinux changes were required.</w:t>
+        <w:t>These paths match your machine. If the DVD is already mounted at /mnt/rhel, skip the mount command.</w:t>
+      </w:r>
+    </w:p>
+    <w:p>
+      <w:pPr>
+        <w:pStyle w:val="Terminal"/>
+        <w:keepLines/>
+        <w:shd w:fill="F3F4F6"/>
+      </w:pPr>
+      <w:r>
+        <w:rPr>
+          <w:rFonts w:ascii="Courier New" w:hAnsi="Courier New"/>
+        </w:rPr>
+        <w:t>sudo mkdir -p /mnt/rhel</w:t>
+        <w:br/>
+        <w:t>sudo mount -o loop,ro \</w:t>
+        <w:br/>
+        <w:t xml:space="preserve">  /home/bstc/Documents/ICCT_NTC/rhel-9.4-x86_64-dvd.iso \</w:t>
+        <w:br/>
+        <w:t xml:space="preserve">  /mnt/rhel</w:t>
+        <w:br/>
+        <w:t>sudo rpm --import /mnt/rhel/RPM-GPG-KEY-redhat-release</w:t>
+        <w:br/>
+        <w:t>sudo dnf --disablerepo="*" \</w:t>
+        <w:br/>
+        <w:t xml:space="preserve">  --repofrompath=np-base,file:///mnt/rhel/BaseOS \</w:t>
+        <w:br/>
+        <w:t xml:space="preserve">  --repofrompath=np-app,file:///mnt/rhel/AppStream \</w:t>
+        <w:br/>
+        <w:t xml:space="preserve">  --enablerepo=np-base,np-app install -y \</w:t>
+        <w:br/>
+        <w:t xml:space="preserve">  gcc make autoconf automake libtool</w:t>
       </w:r>
     </w:p>
     <w:p>
       <w:r>
-        <w:t>Installed RPM: netperf-2.7.0-2.20210803git3bc455b.el9.aarch64. The executable reports Netperf 2.7.1 because this RPM contains a later upstream snapshot. The required lksctp-tools 1.0.19-3.el9_4 was already installed.</w:t>
+        <w:t>Expected: the package installation finishes with “Complete!” or reports that the tools are already installed. Stop if it reports an error.</w:t>
       </w:r>
     </w:p>
     <w:p>
@@ -38,121 +69,106 @@
         <w:pStyle w:val="Heading1"/>
       </w:pPr>
       <w:r>
-        <w:t>Install the prepared offline bundle</w:t>
+        <w:t>2 Build and install Netperf</w:t>
       </w:r>
     </w:p>
     <w:p>
       <w:r>
-        <w:t>Copy the netperf bundle folder from the VM files on the Mac to /root/netperf-offline on the disconnected RHEL host. The bundle contains the ARM64 Netperf RPM, the matching DVD lksctp-tools RPM, signing keys and SHA256SUMS. These RPMs are for aarch64 RHEL 9 only.</w:t>
+        <w:t>Run each command in order. Continue only if the previous command succeeds. The autogen step creates the missing configure file.</w:t>
       </w:r>
     </w:p>
     <w:p>
       <w:pPr>
-        <w:pStyle w:val="Command"/>
+        <w:pStyle w:val="Terminal"/>
+        <w:keepLines/>
+        <w:shd w:fill="F3F4F6"/>
       </w:pPr>
       <w:r>
-        <w:t>su -</w:t>
+        <w:rPr>
+          <w:rFonts w:ascii="Courier New" w:hAnsi="Courier New"/>
+        </w:rPr>
+        <w:t>cd /home/bstc/Downloads/netperf-master</w:t>
+        <w:br/>
+        <w:t>./autogen.sh</w:t>
+        <w:br/>
+        <w:t>./configure</w:t>
+        <w:br/>
+        <w:t>make</w:t>
+        <w:br/>
+        <w:t>sudo make install</w:t>
+      </w:r>
+    </w:p>
+    <w:p>
+      <w:r>
+        <w:t>Successful output excerpts from your supplied installation log</w:t>
       </w:r>
     </w:p>
     <w:p>
       <w:pPr>
-        <w:pStyle w:val="Command"/>
+        <w:pStyle w:val="Terminal"/>
+        <w:keepLines/>
+        <w:shd w:fill="F3F4F6"/>
       </w:pPr>
       <w:r>
-        <w:t>cat /etc/redhat-release</w:t>
+        <w:rPr>
+          <w:rFonts w:ascii="Courier New" w:hAnsi="Courier New"/>
+        </w:rPr>
+        <w:t>config.status: creating Makefile</w:t>
+        <w:br/>
+        <w:t>config.status: creating src/Makefile</w:t>
+        <w:br/>
+        <w:t>/usr/bin/install -c netperf netserver '/usr/local/bin'</w:t>
       </w:r>
     </w:p>
     <w:p>
       <w:pPr>
-        <w:pStyle w:val="Command"/>
+        <w:pStyle w:val="Heading1"/>
       </w:pPr>
       <w:r>
-        <w:t>uname -m</w:t>
+        <w:t>3 Confirm the installed programs</w:t>
       </w:r>
     </w:p>
     <w:p>
       <w:pPr>
-        <w:pStyle w:val="Command"/>
+        <w:pStyle w:val="Terminal"/>
+        <w:keepLines/>
+        <w:shd w:fill="F3F4F6"/>
       </w:pPr>
       <w:r>
-        <w:t>cd /root/netperf-offline</w:t>
+        <w:rPr>
+          <w:rFonts w:ascii="Courier New" w:hAnsi="Courier New"/>
+        </w:rPr>
+        <w:t>/usr/local/bin/netperf -V</w:t>
+        <w:br/>
+        <w:t>ls -l /usr/local/bin/netperf /usr/local/bin/netserver</w:t>
+        <w:br/>
+        <w:t>sudo -u apache /usr/local/bin/netperf -V</w:t>
+      </w:r>
+    </w:p>
+    <w:p>
+      <w:r>
+        <w:rPr>
+          <w:b/>
+        </w:rPr>
+        <w:t>Output</w:t>
       </w:r>
     </w:p>
     <w:p>
       <w:pPr>
-        <w:pStyle w:val="Command"/>
+        <w:pStyle w:val="Terminal"/>
+        <w:keepLines/>
+        <w:shd w:fill="F3F4F6"/>
       </w:pPr>
       <w:r>
-        <w:t>sha256sum -c SHA256SUMS</w:t>
-      </w:r>
-    </w:p>
-    <w:p>
-      <w:pPr>
-        <w:pStyle w:val="Command"/>
-      </w:pPr>
-      <w:r>
-        <w:t>rpm --import RPM-GPG-KEY-EPEL-9</w:t>
-      </w:r>
-    </w:p>
-    <w:p>
-      <w:pPr>
-        <w:pStyle w:val="Command"/>
-      </w:pPr>
-      <w:r>
-        <w:t>rpm --import RPM-GPG-KEY-redhat-release</w:t>
-      </w:r>
-    </w:p>
-    <w:p>
-      <w:pPr>
-        <w:pStyle w:val="Command"/>
-      </w:pPr>
-      <w:r>
-        <w:t>rpm -K ./*.rpm</w:t>
-      </w:r>
-    </w:p>
-    <w:p>
-      <w:pPr>
-        <w:pStyle w:val="Command"/>
-      </w:pPr>
-      <w:r>
-        <w:t>dnf --disablerepo="*" --setopt=localpkg_gpgcheck=1 \</w:t>
-      </w:r>
-    </w:p>
-    <w:p>
-      <w:pPr>
-        <w:pStyle w:val="Command"/>
-      </w:pPr>
-      <w:r>
-        <w:t xml:space="preserve">    install -y ./*.rpm</w:t>
-      </w:r>
-    </w:p>
-    <w:p>
-      <w:pPr>
-        <w:pStyle w:val="Command"/>
-      </w:pPr>
-      <w:r>
-        <w:t>rpm -q netperf lksctp-tools</w:t>
-      </w:r>
-    </w:p>
-    <w:p>
-      <w:pPr>
-        <w:pStyle w:val="Command"/>
-      </w:pPr>
-      <w:r>
-        <w:t>netperf -V</w:t>
-      </w:r>
-    </w:p>
-    <w:p>
-      <w:pPr>
-        <w:pStyle w:val="Command"/>
-      </w:pPr>
-      <w:r>
-        <w:t>netserver -V</w:t>
+        <w:rPr>
+          <w:rFonts w:ascii="Courier New" w:hAnsi="Courier New"/>
+        </w:rPr>
+        <w:t>Netperf version 2.7.1</w:t>
       </w:r>
     </w:p>
     <w:p>
       <w:r>
-        <w:t>Use trusted keys supplied through your approved media process. Continue only when the RPM signature checks succeed. Do not use --nogpgcheck or --nodeps. Existing RHEL base libraries must already be present; if dependencies are missing, use the matching RHEL installation DVD or prepare the full dependency bundle on page 2.</w:t>
+        <w:t>The file listing should show both executable files. The apache check confirms the Cacti collector account can run Netperf. Use your collector account if it is not apache. A source install is not listed by rpm -q netperf.</w:t>
       </w:r>
     </w:p>
     <w:p>
@@ -162,156 +178,15 @@
     </w:p>
     <w:p>
       <w:pPr>
-        <w:pStyle w:val="Heading1"/>
+        <w:pStyle w:val="Title"/>
       </w:pPr>
       <w:r>
-        <w:t>Prepare packages on an internet connected machine</w:t>
+        <w:t>Verify Netperf readings</w:t>
       </w:r>
     </w:p>
     <w:p>
       <w:r>
-        <w:t>Use a separate RHEL 9 staging machine with the same CPU architecture as the offline target. The commands in this section require internet access on that staging machine only. The current VM requires aarch64; x86_64 systems require their own RPMs.</w:t>
-      </w:r>
-    </w:p>
-    <w:p>
-      <w:pPr>
-        <w:pStyle w:val="Command"/>
-      </w:pPr>
-      <w:r>
-        <w:t>su -</w:t>
-      </w:r>
-    </w:p>
-    <w:p>
-      <w:pPr>
-        <w:pStyle w:val="Command"/>
-      </w:pPr>
-      <w:r>
-        <w:t>cat /etc/redhat-release</w:t>
-      </w:r>
-    </w:p>
-    <w:p>
-      <w:pPr>
-        <w:pStyle w:val="Command"/>
-      </w:pPr>
-      <w:r>
-        <w:t>uname -m</w:t>
-      </w:r>
-    </w:p>
-    <w:p>
-      <w:pPr>
-        <w:pStyle w:val="Command"/>
-      </w:pPr>
-      <w:r>
-        <w:t>dnf install -y dnf-plugins-core</w:t>
-      </w:r>
-    </w:p>
-    <w:p>
-      <w:pPr>
-        <w:pStyle w:val="Command"/>
-      </w:pPr>
-      <w:r>
-        <w:t>subscription-manager repos \</w:t>
-      </w:r>
-    </w:p>
-    <w:p>
-      <w:pPr>
-        <w:pStyle w:val="Command"/>
-      </w:pPr>
-      <w:r>
-        <w:t xml:space="preserve">    --enable="codeready-builder-for-rhel-9-$(arch)-rpms"</w:t>
-      </w:r>
-    </w:p>
-    <w:p>
-      <w:pPr>
-        <w:pStyle w:val="Command"/>
-      </w:pPr>
-      <w:r>
-        <w:t>dnf install -y \</w:t>
-      </w:r>
-    </w:p>
-    <w:p>
-      <w:pPr>
-        <w:pStyle w:val="Command"/>
-      </w:pPr>
-      <w:r>
-        <w:t xml:space="preserve">    https://dl.fedoraproject.org/pub/epel/epel-release-latest-9.noarch.rpm</w:t>
-      </w:r>
-    </w:p>
-    <w:p>
-      <w:pPr>
-        <w:pStyle w:val="Command"/>
-      </w:pPr>
-      <w:r>
-        <w:t>mkdir -p /root/netperf-offline</w:t>
-      </w:r>
-    </w:p>
-    <w:p>
-      <w:pPr>
-        <w:pStyle w:val="Command"/>
-      </w:pPr>
-      <w:r>
-        <w:t>dnf download --resolve --alldeps \</w:t>
-      </w:r>
-    </w:p>
-    <w:p>
-      <w:pPr>
-        <w:pStyle w:val="Command"/>
-      </w:pPr>
-      <w:r>
-        <w:t xml:space="preserve">    --destdir=/root/netperf-offline netperf</w:t>
-      </w:r>
-    </w:p>
-    <w:p>
-      <w:pPr>
-        <w:pStyle w:val="Command"/>
-      </w:pPr>
-      <w:r>
-        <w:t>cp /etc/pki/rpm-gpg/RPM-GPG-KEY-EPEL-9 /root/netperf-offline/</w:t>
-      </w:r>
-    </w:p>
-    <w:p>
-      <w:pPr>
-        <w:pStyle w:val="Command"/>
-      </w:pPr>
-      <w:r>
-        <w:t>cp /etc/pki/rpm-gpg/RPM-GPG-KEY-redhat-release \</w:t>
-      </w:r>
-    </w:p>
-    <w:p>
-      <w:pPr>
-        <w:pStyle w:val="Command"/>
-      </w:pPr>
-      <w:r>
-        <w:t xml:space="preserve">    /root/netperf-offline/</w:t>
-      </w:r>
-    </w:p>
-    <w:p>
-      <w:pPr>
-        <w:pStyle w:val="Command"/>
-      </w:pPr>
-      <w:r>
-        <w:t>cd /root/netperf-offline</w:t>
-      </w:r>
-    </w:p>
-    <w:p>
-      <w:pPr>
-        <w:pStyle w:val="Command"/>
-      </w:pPr>
-      <w:r>
-        <w:t>rpm -K ./*.rpm</w:t>
-      </w:r>
-    </w:p>
-    <w:p>
-      <w:pPr>
-        <w:pStyle w:val="Command"/>
-      </w:pPr>
-      <w:r>
-        <w:t>sha256sum ./*.rpm RPM-GPG-KEY-* &gt; SHA256SUMS</w:t>
-      </w:r>
-    </w:p>
-    <w:p>
-      <w:r>
-        <w:t>This general staging method requires working RHEL subscriptions and approved repositories. Keep staging and target RHEL updates aligned. The prepared VM bundle needs only Netperf and lksctp-tools because its base libraries were already installed; it is not a universal dependency bundle for every RHEL installation.</w:t>
+        <w:t>Use two terminals on the same RHEL machine. This short local test confirms Netperf produces a reading. It does not measure the speed of a physical network link.</w:t>
       </w:r>
     </w:p>
     <w:p>
@@ -319,57 +194,50 @@
         <w:pStyle w:val="Heading1"/>
       </w:pPr>
       <w:r>
-        <w:t>Download the exact tested RPM from a connected Mac</w:t>
+        <w:t>4 Start the local test server in terminal 1</w:t>
       </w:r>
     </w:p>
     <w:p>
       <w:pPr>
-        <w:pStyle w:val="Command"/>
+        <w:pStyle w:val="Terminal"/>
+        <w:keepLines/>
+        <w:shd w:fill="F3F4F6"/>
       </w:pPr>
       <w:r>
-        <w:t>mkdir -p netperf-offline</w:t>
+        <w:rPr>
+          <w:rFonts w:ascii="Courier New" w:hAnsi="Courier New"/>
+        </w:rPr>
+        <w:t>sudo timeout --signal=TERM --kill-after=1 60 \</w:t>
+        <w:br/>
+        <w:t xml:space="preserve">  /usr/local/bin/netserver -D -f -L 127.0.0.1 -p 12865</w:t>
+      </w:r>
+    </w:p>
+    <w:p>
+      <w:r>
+        <w:rPr>
+          <w:b/>
+        </w:rPr>
+        <w:t>Output</w:t>
       </w:r>
     </w:p>
     <w:p>
       <w:pPr>
-        <w:pStyle w:val="Command"/>
+        <w:pStyle w:val="Terminal"/>
+        <w:keepLines/>
+        <w:shd w:fill="F3F4F6"/>
       </w:pPr>
       <w:r>
-        <w:t>cd netperf-offline</w:t>
-      </w:r>
-    </w:p>
-    <w:p>
-      <w:pPr>
-        <w:pStyle w:val="Command"/>
-      </w:pPr>
-      <w:r>
-        <w:t>base=https://dl.fedoraproject.org/pub/epel/9/Everything</w:t>
-      </w:r>
-    </w:p>
-    <w:p>
-      <w:pPr>
-        <w:pStyle w:val="Command"/>
-      </w:pPr>
-      <w:r>
-        <w:t>pkg=netperf-2.7.0-2.20210803git3bc455b.el9.aarch64.rpm</w:t>
-      </w:r>
-    </w:p>
-    <w:p>
-      <w:pPr>
-        <w:pStyle w:val="Command"/>
-      </w:pPr>
-      <w:r>
-        <w:t>curl -fLO "$base/aarch64/Packages/n/$pkg"</w:t>
+        <w:rPr>
+          <w:rFonts w:ascii="Courier New" w:hAnsi="Courier New"/>
+        </w:rPr>
+        <w:t>Starting netserver with host '127.0.0.1' port '12865'</w:t>
+        <w:br/>
+        <w:t>and family AF_UNSPEC</w:t>
       </w:r>
     </w:p>
     <w:p>
       <w:r>
-        <w:t>Transfer the downloaded file and trusted signing key by approved removable media or an internal file transfer. The RHEL VM does not need internet access. The lksctp-tools RPM is available on this VM’s mounted DVD under /mnt/rhel9/BaseOS/Packages/. Verify signatures on the target before installation.</w:t>
-      </w:r>
-    </w:p>
-    <w:p>
-      <w:r>
-        <w:br w:type="page"/>
+        <w:t>Leave this terminal running. The server stops automatically after 60 seconds, or press Ctrl+C after the client test finishes.</w:t>
       </w:r>
     </w:p>
     <w:p>
@@ -377,17 +245,87 @@
         <w:pStyle w:val="Heading1"/>
       </w:pPr>
       <w:r>
-        <w:t>Run Netperf and verify the plugin</w:t>
+        <w:t>5 Read throughput in terminal 2</w:t>
+      </w:r>
+    </w:p>
+    <w:p>
+      <w:pPr>
+        <w:pStyle w:val="Terminal"/>
+        <w:keepLines/>
+        <w:shd w:fill="F3F4F6"/>
+      </w:pPr>
+      <w:r>
+        <w:rPr>
+          <w:rFonts w:ascii="Courier New" w:hAnsi="Courier New"/>
+        </w:rPr>
+        <w:t>sudo -u apache /usr/local/bin/netperf \</w:t>
+        <w:br/>
+        <w:t xml:space="preserve">  -H 127.0.0.1 -p 12865 -t TCP_STREAM -l 3</w:t>
       </w:r>
     </w:p>
     <w:p>
       <w:r>
-        <w:t>NMS 1.10.70 starts a temporary loopback-only netserver when the selected target is a loopback IP such as 127.0.0.1. The server has a time limit and is stopped after the test. This measures the collector itself and does not measure a physical network link.</w:t>
+        <w:t>Actual three second result from the RHEL verification VM; your throughput will differ. The VM uses RPM binaries in /usr/bin; the source installation above uses /usr/local/bin with the same options.</w:t>
+      </w:r>
+    </w:p>
+    <w:p>
+      <w:pPr>
+        <w:pStyle w:val="Terminal"/>
+        <w:keepLines/>
+        <w:shd w:fill="F3F4F6"/>
+      </w:pPr>
+      <w:r>
+        <w:rPr>
+          <w:rFonts w:ascii="Courier New" w:hAnsi="Courier New"/>
+        </w:rPr>
+        <w:t>Recv   Send    Send</w:t>
+        <w:br/>
+        <w:t>Socket Socket  Message  Elapsed</w:t>
+        <w:br/>
+        <w:t>Size   Size    Size     Time     Throughput</w:t>
+        <w:br/>
+        <w:t>bytes  bytes   bytes    secs.    10^6bits/sec</w:t>
+        <w:br/>
+        <w:t>131072 16384   16384    3.00     76108.22</w:t>
       </w:r>
     </w:p>
     <w:p>
       <w:r>
-        <w:t>In Cacti open NMS → Presets → Protocol checks. Allow up to 60 seconds for the collector’s tool inventory to refresh, reload the page, select the device and Netperf bandwidth, then choose Run selected test. Open the saved result in Test history. A successful TCP_STREAM result reports throughput in 10^6 bits/sec, which is Mbit/s.</w:t>
+        <w:t>A numeric value in the last column means Netperf is returning throughput. Here, 76108.22 is Mbps. Immediately check the exit code:</w:t>
+      </w:r>
+    </w:p>
+    <w:p>
+      <w:pPr>
+        <w:pStyle w:val="Terminal"/>
+        <w:keepLines/>
+        <w:shd w:fill="F3F4F6"/>
+      </w:pPr>
+      <w:r>
+        <w:rPr>
+          <w:rFonts w:ascii="Courier New" w:hAnsi="Courier New"/>
+        </w:rPr>
+        <w:t>echo $?</w:t>
+      </w:r>
+    </w:p>
+    <w:p>
+      <w:r>
+        <w:rPr>
+          <w:b/>
+        </w:rPr>
+        <w:t>Output</w:t>
+      </w:r>
+    </w:p>
+    <w:p>
+      <w:pPr>
+        <w:pStyle w:val="Terminal"/>
+        <w:keepLines/>
+        <w:shd w:fill="F3F4F6"/>
+      </w:pPr>
+      <w:r>
+        <w:rPr>
+          <w:rFonts w:ascii="Courier New" w:hAnsi="Courier New"/>
+        </w:rPr>
+        <w:t>0</w:t>
       </w:r>
     </w:p>
     <w:p>
@@ -395,41 +333,17 @@
         <w:pStyle w:val="Heading1"/>
       </w:pPr>
       <w:r>
-        <w:t>Manual local test using two terminals</w:t>
+        <w:t>6 Confirm the reading in Cacti NMS</w:t>
       </w:r>
     </w:p>
     <w:p>
       <w:r>
-        <w:t>Run this bounded server in terminal 1. It listens only on loopback and stops after one minute even if the client never connects. A serial server avoids background child processes.</w:t>
-      </w:r>
-    </w:p>
-    <w:p>
-      <w:pPr>
-        <w:pStyle w:val="Command"/>
-      </w:pPr>
-      <w:r>
-        <w:t>timeout --signal=TERM --kill-after=1 60 \</w:t>
-      </w:r>
-    </w:p>
-    <w:p>
-      <w:pPr>
-        <w:pStyle w:val="Command"/>
-      </w:pPr>
-      <w:r>
-        <w:t xml:space="preserve">    netserver -D -f -L 127.0.0.1 -p 12865</w:t>
+        <w:t>Open Presets → Protocol checks → Bandwidth tests. Select the local device with address 127.0.0.1, choose Netperf, and click Run bandwidth test. Netperf must be enabled in the device’s diagnostic profile.</w:t>
       </w:r>
     </w:p>
     <w:p>
       <w:r>
-        <w:t>While the server is running, run this command in terminal 2. Client and high-port server tests can run as an ordinary account.</w:t>
-      </w:r>
-    </w:p>
-    <w:p>
-      <w:pPr>
-        <w:pStyle w:val="Command"/>
-      </w:pPr>
-      <w:r>
-        <w:t>netperf -H 127.0.0.1 -p 12865 -t TCP_STREAM -l 3</w:t>
+        <w:t>Success: the result shows Exit code 0 and a numeric Transfer speed in Mbps. If installation is not detected yet, wait up to 60 seconds and refresh. NMS starts its own temporary server for the local self-test.</w:t>
       </w:r>
     </w:p>
     <w:p>
@@ -437,240 +351,27 @@
         <w:pStyle w:val="Heading1"/>
       </w:pPr>
       <w:r>
-        <w:t>Test a real remote device</w:t>
+        <w:t>If no reading appears</w:t>
       </w:r>
     </w:p>
     <w:p>
       <w:r>
-        <w:t>Install Netperf on both the collector and the remote Linux endpoint. Start netserver on the endpoint using its actual IP address. Replace 192.0.2.20 below with that address; it is only a documentation example.</w:t>
-      </w:r>
-    </w:p>
-    <w:p>
-      <w:pPr>
-        <w:pStyle w:val="Command"/>
-      </w:pPr>
-      <w:r>
-        <w:t>timeout --signal=TERM --kill-after=1 300 \</w:t>
-      </w:r>
-    </w:p>
-    <w:p>
-      <w:pPr>
-        <w:pStyle w:val="Command"/>
-      </w:pPr>
-      <w:r>
-        <w:t xml:space="preserve">    netserver -D -f -L 192.0.2.20 -p 12865</w:t>
+        <w:t>Connection refused: start terminal 1 again and run the client before its 60 second limit. Address already in use: check the existing listener with sudo ss -ltnp 'sport = :12865'. Command not found: repeat step 3 using the full /usr/local/bin path.</w:t>
       </w:r>
     </w:p>
     <w:p>
       <w:r>
-        <w:t>On the collector, test that endpoint while the server is running.</w:t>
+        <w:t>For a remote bandwidth test, the destination must run netserver. The network must allow TCP 12865 and the separate negotiated data connection.</w:t>
       </w:r>
     </w:p>
-    <w:p>
-      <w:pPr>
-        <w:pStyle w:val="Command"/>
-      </w:pPr>
-      <w:r>
-        <w:t>netperf -H 192.0.2.20 -p 12865 -t TCP_STREAM -l 3</w:t>
-      </w:r>
-    </w:p>
-    <w:p>
-      <w:r>
-        <w:t>Netperf uses a control connection on TCP 12865 and a separate negotiated data connection. Existing network policy must allow both between the approved hosts. Opening only 12865 may be insufficient. The plugin does not change firewall rules or start servers on remote devices. The package service remains disabled and inactive on this VM.</w:t>
-      </w:r>
-    </w:p>
-    <w:p>
-      <w:r>
-        <w:br w:type="page"/>
-      </w:r>
-    </w:p>
-    <w:p>
-      <w:pPr>
-        <w:pStyle w:val="Heading1"/>
-      </w:pPr>
-      <w:r>
-        <w:t>Troubleshooting and official sources</w:t>
-      </w:r>
-    </w:p>
-    <w:p>
-      <w:r>
-        <w:t>Not installed on collector: run command -v netperf and rpm -q netperf on the device’s assigned collector, not only on the Cacti web server. Check that the collector account can execute the installed binary. Refresh the NMS page after the next tool-inventory update.</w:t>
-      </w:r>
-    </w:p>
-    <w:p>
-      <w:r>
-        <w:t>Connection refused: verify netserver is running at the target address and port. A missing server is not fixed by installing only the client. Timeout: verify the route and both control and data connections. No package available: use EPEL 9 packages matching the architecture; the tested RHEL DVD did not contain Netperf.</w:t>
-      </w:r>
-    </w:p>
-    <w:p>
-      <w:pPr>
-        <w:pStyle w:val="Command"/>
-      </w:pPr>
-      <w:r>
-        <w:t>command -v netperf netserver</w:t>
-      </w:r>
-    </w:p>
-    <w:p>
-      <w:pPr>
-        <w:pStyle w:val="Command"/>
-      </w:pPr>
-      <w:r>
-        <w:t>rpm -q netperf lksctp-tools</w:t>
-      </w:r>
-    </w:p>
-    <w:p>
-      <w:pPr>
-        <w:pStyle w:val="Command"/>
-      </w:pPr>
-      <w:r>
-        <w:t>ss -ltnp sport = :12865</w:t>
-      </w:r>
-    </w:p>
-    <w:p>
-      <w:pPr>
-        <w:pStyle w:val="Command"/>
-      </w:pPr>
-      <w:r>
-        <w:t>pgrep -a netserver</w:t>
-      </w:r>
-    </w:p>
-    <w:p>
-      <w:pPr>
-        <w:pStyle w:val="Command"/>
-      </w:pPr>
-      <w:r>
-        <w:t>systemctl is-active netserver</w:t>
-      </w:r>
-    </w:p>
-    <w:p>
-      <w:pPr>
-        <w:pStyle w:val="Command"/>
-      </w:pPr>
-      <w:r>
-        <w:t>systemctl is-enabled netserver</w:t>
-      </w:r>
-    </w:p>
-    <w:p>
-      <w:r>
-        <w:t>For plugin loopback self-tests, no netserver process should remain after completion. The automatically allocated self-test port is temporary and differs from the standard remote port 12865. Earlier failed records remain unchanged in Test history; run a new test to validate the installed package.</w:t>
-      </w:r>
-    </w:p>
-    <w:p>
-      <w:pPr>
-        <w:pStyle w:val="Heading1"/>
-      </w:pPr>
-      <w:r>
-        <w:t>Package websites</w:t>
-      </w:r>
-    </w:p>
-    <w:p>
-      <w:hyperlink r:id="rId9">
-        <w:r>
-          <w:rPr>
-            <w:color w:val="0563C1"/>
-          </w:rPr>
-          <w:t>Fedora Netperf package and EPEL releases</w:t>
-        </w:r>
-      </w:hyperlink>
-    </w:p>
-    <w:p>
-      <w:hyperlink r:id="rId10">
-        <w:r>
-          <w:rPr>
-            <w:color w:val="0563C1"/>
-          </w:rPr>
-          <w:t>Official EPEL 9 ARM64 package directory</w:t>
-        </w:r>
-      </w:hyperlink>
-    </w:p>
-    <w:p>
-      <w:hyperlink r:id="rId11">
-        <w:r>
-          <w:rPr>
-            <w:color w:val="0563C1"/>
-          </w:rPr>
-          <w:t>Official EPEL 9 x86 64 package directory</w:t>
-        </w:r>
-      </w:hyperlink>
-    </w:p>
-    <w:p>
-      <w:hyperlink r:id="rId12">
-        <w:r>
-          <w:rPr>
-            <w:color w:val="0563C1"/>
-          </w:rPr>
-          <w:t>EPEL signing key</w:t>
-        </w:r>
-      </w:hyperlink>
-    </w:p>
-    <w:p>
-      <w:hyperlink r:id="rId13">
-        <w:r>
-          <w:rPr>
-            <w:color w:val="0563C1"/>
-          </w:rPr>
-          <w:t>Fedora EPEL setup documentation</w:t>
-        </w:r>
-      </w:hyperlink>
-    </w:p>
-    <w:p>
-      <w:hyperlink r:id="rId14">
-        <w:r>
-          <w:rPr>
-            <w:color w:val="0563C1"/>
-          </w:rPr>
-          <w:t>Netperf upstream project</w:t>
-        </w:r>
-      </w:hyperlink>
-    </w:p>
-    <w:p>
-      <w:hyperlink r:id="rId15">
-        <w:r>
-          <w:rPr>
-            <w:color w:val="0563C1"/>
-          </w:rPr>
-          <w:t>Netperf upstream manual</w:t>
-        </w:r>
-      </w:hyperlink>
-    </w:p>
-    <w:p>
-      <w:r>
-        <w:t>Netperf is supplied here by the Fedora EPEL community repository. Do not describe it as a package shipped on the RHEL DVD. Package availability and repository versions may change; the installed version above records the exact build verified for this VM.</w:t>
-      </w:r>
-    </w:p>
-    <w:p>
-      <w:r>
-        <w:t xml:space="preserve">Plugin source and updates: </w:t>
-      </w:r>
-      <w:hyperlink r:id="rId17">
-        <w:r>
-          <w:t>https://github.com/SKhan009/cacti-nms-plugin</w:t>
-        </w:r>
-      </w:hyperlink>
-    </w:p>
     <w:sectPr>
-      <w:footerReference w:type="default" r:id="rId16"/>
-      <w:pgSz w:w="12240" w:h="15840"/>
-      <w:pgMar w:top="1008" w:right="1080" w:bottom="1008" w:left="1080" w:header="720" w:footer="720" w:gutter="0"/>
+      <w:pgSz w:w="11909" w:h="16834"/>
+      <w:pgMar w:top="936" w:right="1008" w:bottom="936" w:left="1008" w:header="720" w:footer="720" w:gutter="0"/>
       <w:cols w:space="720"/>
       <w:docGrid w:linePitch="360"/>
     </w:sectPr>
   </w:body>
 </w:document>
-</file>
-
-<file path=word/footer1.xml><?xml version="1.0" encoding="utf-8"?>
-<w:ftr xmlns:m="http://schemas.openxmlformats.org/officeDocument/2006/math" xmlns:mc="http://schemas.openxmlformats.org/markup-compatibility/2006" xmlns:mo="http://schemas.microsoft.com/office/mac/office/2008/main" xmlns:mv="urn:schemas-microsoft-com:mac:vml" xmlns:o="urn:schemas-microsoft-com:office:office" xmlns:r="http://schemas.openxmlformats.org/officeDocument/2006/relationships" xmlns:v="urn:schemas-microsoft-com:vml" xmlns:w10="urn:schemas-microsoft-com:office:word" xmlns:w14="http://schemas.microsoft.com/office/word/2010/wordml" xmlns:w="http://schemas.openxmlformats.org/wordprocessingml/2006/main" xmlns:wne="http://schemas.microsoft.com/office/word/2006/wordml" xmlns:wp14="http://schemas.microsoft.com/office/word/2010/wordprocessingDrawing" xmlns:wp="http://schemas.openxmlformats.org/drawingml/2006/wordprocessingDrawing" xmlns:wpc="http://schemas.microsoft.com/office/word/2010/wordprocessingCanvas" xmlns:wpg="http://schemas.microsoft.com/office/word/2010/wordprocessingGroup" xmlns:wpi="http://schemas.microsoft.com/office/word/2010/wordprocessingInk" xmlns:wps="http://schemas.microsoft.com/office/word/2010/wordprocessingShape" mc:Ignorable="w14 wp14">
-  <w:p>
-    <w:pPr>
-      <w:pStyle w:val="Footer"/>
-    </w:pPr>
-    <w:r>
-      <w:t xml:space="preserve">Cacti NMS  |  Netperf offline installation  |  </w:t>
-    </w:r>
-    <w:fldSimple w:instr="PAGE"/>
-  </w:p>
-</w:ftr>
 </file>
 
 <file path=word/numbering.xml><?xml version="1.0" encoding="utf-8"?>
@@ -1037,11 +738,12 @@
     <w:qFormat/>
     <w:rsid w:val="00FC693F"/>
     <w:pPr>
-      <w:spacing w:after="140"/>
+      <w:spacing w:after="120" w:line="252" w:lineRule="auto"/>
     </w:pPr>
     <w:rPr>
-      <w:rFonts w:ascii="Calibri" w:hAnsi="Calibri"/>
-      <w:sz w:val="22"/>
+      <w:rFonts w:ascii="Arial" w:hAnsi="Arial"/>
+      <w:color w:val="000000"/>
+      <w:sz w:val="20"/>
     </w:rPr>
   </w:style>
   <w:style w:type="paragraph" w:styleId="Header">
@@ -1099,15 +801,15 @@
     <w:pPr>
       <w:keepNext/>
       <w:keepLines/>
-      <w:spacing w:before="480" w:after="0"/>
+      <w:spacing w:before="200" w:after="100"/>
       <w:outlineLvl w:val="0"/>
     </w:pPr>
     <w:rPr>
-      <w:rFonts w:asciiTheme="majorHAnsi" w:eastAsiaTheme="majorEastAsia" w:hAnsiTheme="majorHAnsi" w:cstheme="majorBidi"/>
+      <w:rFonts w:asciiTheme="majorHAnsi" w:eastAsiaTheme="majorEastAsia" w:hAnsiTheme="majorHAnsi" w:cstheme="majorBidi" w:ascii="Arial" w:hAnsi="Arial"/>
       <w:b/>
       <w:bCs/>
       <w:color w:val="000000"/>
-      <w:sz w:val="28"/>
+      <w:sz w:val="26"/>
       <w:szCs w:val="28"/>
     </w:rPr>
   </w:style>
@@ -1127,7 +829,7 @@
       <w:outlineLvl w:val="1"/>
     </w:pPr>
     <w:rPr>
-      <w:rFonts w:asciiTheme="majorHAnsi" w:eastAsiaTheme="majorEastAsia" w:hAnsiTheme="majorHAnsi" w:cstheme="majorBidi"/>
+      <w:rFonts w:asciiTheme="majorHAnsi" w:eastAsiaTheme="majorEastAsia" w:hAnsiTheme="majorHAnsi" w:cstheme="majorBidi" w:ascii="Arial" w:hAnsi="Arial"/>
       <w:b/>
       <w:bCs/>
       <w:color w:val="000000"/>
@@ -1389,11 +1091,11 @@
       <w:contextualSpacing/>
     </w:pPr>
     <w:rPr>
-      <w:rFonts w:asciiTheme="majorHAnsi" w:eastAsiaTheme="majorEastAsia" w:hAnsiTheme="majorHAnsi" w:cstheme="majorBidi"/>
+      <w:rFonts w:asciiTheme="majorHAnsi" w:eastAsiaTheme="majorEastAsia" w:hAnsiTheme="majorHAnsi" w:cstheme="majorBidi" w:ascii="Arial" w:hAnsi="Arial"/>
       <w:color w:val="000000"/>
       <w:spacing w:val="5"/>
       <w:kern w:val="28"/>
-      <w:sz w:val="50"/>
+      <w:sz w:val="42"/>
       <w:szCs w:val="52"/>
     </w:rPr>
   </w:style>
@@ -12720,14 +12422,14 @@
       </w:tcPr>
     </w:tblStylePr>
   </w:style>
-  <w:style w:type="paragraph" w:customStyle="1" w:styleId="Command">
-    <w:name w:val="Command"/>
-    <w:pPr>
-      <w:spacing w:after="60"/>
+  <w:style w:type="paragraph" w:customStyle="1" w:styleId="Terminal">
+    <w:name w:val="Terminal"/>
+    <w:pPr>
+      <w:spacing w:after="120" w:line="240" w:lineRule="auto"/>
     </w:pPr>
     <w:rPr>
       <w:rFonts w:ascii="Courier New" w:hAnsi="Courier New"/>
-      <w:sz w:val="18"/>
+      <w:sz w:val="17"/>
     </w:rPr>
   </w:style>
 </w:styles>

</xml_diff>